<commit_message>
docs: remove en dash and polish text to Australian English in new handbook sections
- Replace "5–10 images" range with "5 to 10 images" (no dashes)
- Replace "frontend/backend" with "frontend and backend" in intro sentence
- All new sections now use consistent Australian English spelling and punctuation
</commit_message>
<xml_diff>
--- a/Project_Handbook.docx
+++ b/Project_Handbook.docx
@@ -12921,7 +12921,7 @@
           <w:sz w:val="24"/>
           <w:szCs w:val="24"/>
         </w:rPr>
-        <w:t xml:space="preserve">The Deciffer application has been deployed using a split frontend/backend architecture across two cloud platforms: Railway for the backend API and Netlify for the React frontend.</w:t>
+        <w:t xml:space="preserve">The Deciffer application has been deployed using a split frontend and backend architecture across two cloud platforms: Railway for the backend API and Netlify for the React frontend.</w:t>
       </w:r>
     </w:p>
     <w:p>
@@ -13203,7 +13203,7 @@
           <w:sz w:val="24"/>
           <w:szCs w:val="24"/>
         </w:rPr>
-        <w:t xml:space="preserve">Uploading many images simultaneously (typically more than 5–10 high-resolution images) may exhaust server memory and result in the request being terminated with an out-of-memory error.</w:t>
+        <w:t xml:space="preserve">Uploading many images simultaneously (typically more than 5 to 10 high-resolution images) may exhaust server memory and result in the request being terminated with an out-of-memory error.</w:t>
       </w:r>
     </w:p>
     <w:p>

</xml_diff>

<commit_message>
docs: move cloud deployment sections to after Ch.5 and renumber chapters
Relocated "Cloud Deployment Implementation" and "Important Notice:
Memory Limitations" from the end of the document to immediately after
Chapter 5 (First-Time Setup), where deployment context fits naturally.
Chapters numbered accordingly: new sections become 6 and 7; former
chapters 6–16 shift to 8–18.
</commit_message>
<xml_diff>
--- a/Project_Handbook.docx
+++ b/Project_Handbook.docx
@@ -940,7 +940,7 @@
                 <w:rFonts w:ascii="Times New Roman" w:hAnsi="Times New Roman" w:cs="Times New Roman"/>
                 <w:noProof/>
               </w:rPr>
-              <w:t>6. Project Structure</w:t>
+              <w:t>8. Project Structure</w:t>
             </w:r>
             <w:r>
               <w:rPr>
@@ -976,7 +976,7 @@
                 <w:rFonts w:ascii="Times New Roman" w:hAnsi="Times New Roman" w:cs="Times New Roman"/>
                 <w:noProof/>
               </w:rPr>
-              <w:t>7. Daily Startup</w:t>
+              <w:t>9. Daily Startup</w:t>
             </w:r>
             <w:r>
               <w:rPr>
@@ -1120,7 +1120,7 @@
                 <w:rFonts w:ascii="Times New Roman" w:hAnsi="Times New Roman" w:cs="Times New Roman"/>
                 <w:noProof/>
               </w:rPr>
-              <w:t>8. Using the Application</w:t>
+              <w:t>10. Using the Application</w:t>
             </w:r>
             <w:r>
               <w:rPr>
@@ -1336,7 +1336,7 @@
                 <w:rFonts w:ascii="Times New Roman" w:hAnsi="Times New Roman" w:cs="Times New Roman"/>
                 <w:noProof/>
               </w:rPr>
-              <w:t>9. Configuration Reference</w:t>
+              <w:t>11. Configuration Reference</w:t>
             </w:r>
             <w:r>
               <w:rPr>
@@ -1372,7 +1372,7 @@
                 <w:rFonts w:ascii="Times New Roman" w:hAnsi="Times New Roman" w:cs="Times New Roman"/>
                 <w:noProof/>
               </w:rPr>
-              <w:t>10. API Reference</w:t>
+              <w:t>12. API Reference</w:t>
             </w:r>
             <w:r>
               <w:rPr>
@@ -1552,7 +1552,7 @@
                 <w:rFonts w:ascii="Times New Roman" w:hAnsi="Times New Roman" w:cs="Times New Roman"/>
                 <w:noProof/>
               </w:rPr>
-              <w:t>11. Security and Privacy Notes</w:t>
+              <w:t>13. Security and Privacy Notes</w:t>
             </w:r>
             <w:r>
               <w:rPr>
@@ -1588,7 +1588,7 @@
                 <w:rFonts w:ascii="Times New Roman" w:hAnsi="Times New Roman" w:cs="Times New Roman"/>
                 <w:noProof/>
               </w:rPr>
-              <w:t>12. Stopping the Application</w:t>
+              <w:t>14. Stopping the Application</w:t>
             </w:r>
             <w:r>
               <w:rPr>
@@ -1624,7 +1624,7 @@
                 <w:rFonts w:ascii="Times New Roman" w:hAnsi="Times New Roman" w:cs="Times New Roman"/>
                 <w:noProof/>
               </w:rPr>
-              <w:t>13. Troubleshooting</w:t>
+              <w:t>15. Troubleshooting</w:t>
             </w:r>
             <w:r>
               <w:rPr>
@@ -2020,7 +2020,7 @@
                 <w:rFonts w:ascii="Times New Roman" w:hAnsi="Times New Roman" w:cs="Times New Roman"/>
                 <w:noProof/>
               </w:rPr>
-              <w:t>14. Frequently Asked Questions</w:t>
+              <w:t>16. Frequently Asked Questions</w:t>
             </w:r>
             <w:r>
               <w:rPr>
@@ -2056,7 +2056,7 @@
                 <w:rFonts w:ascii="Times New Roman" w:hAnsi="Times New Roman" w:cs="Times New Roman"/>
                 <w:noProof/>
               </w:rPr>
-              <w:t>15. Team and Support</w:t>
+              <w:t>17. Team and Support</w:t>
             </w:r>
             <w:r>
               <w:rPr>
@@ -2092,7 +2092,7 @@
                 <w:rFonts w:ascii="Times New Roman" w:hAnsi="Times New Roman" w:cs="Times New Roman"/>
                 <w:noProof/>
               </w:rPr>
-              <w:t>16. Glossary</w:t>
+              <w:t>18. Glossary</w:t>
             </w:r>
             <w:r>
               <w:rPr>
@@ -6987,6 +6987,475 @@
     <w:p>
       <w:pPr>
         <w:pStyle w:val="Heading1"/>
+      </w:pPr>
+      <w:r>
+        <w:t>6. Cloud Deployment Implementation</w:t>
+      </w:r>
+    </w:p>
+    <w:p>
+      <w:pPr>
+        <w:rPr>
+          <w:rFonts w:ascii="Times New Roman" w:hAnsi="Times New Roman" w:cs="Times New Roman"/>
+          <w:sz w:val="24"/>
+          <w:szCs w:val="24"/>
+        </w:rPr>
+      </w:pPr>
+      <w:r>
+        <w:rPr>
+          <w:rFonts w:ascii="Times New Roman" w:hAnsi="Times New Roman" w:cs="Times New Roman"/>
+          <w:sz w:val="24"/>
+          <w:szCs w:val="24"/>
+        </w:rPr>
+        <w:t xml:space="preserve">The Deciffer application has been deployed using a split frontend and backend architecture across two cloud platforms: Railway for the backend API and Netlify for the React frontend.</w:t>
+      </w:r>
+    </w:p>
+    <w:p>
+      <w:pPr>
+        <w:pStyle w:val="Heading2"/>
+      </w:pPr>
+      <w:r>
+        <w:t>Deployment Architecture</w:t>
+      </w:r>
+    </w:p>
+    <w:p>
+      <w:pPr>
+        <w:rPr>
+          <w:rFonts w:ascii="Times New Roman" w:hAnsi="Times New Roman" w:cs="Times New Roman"/>
+          <w:sz w:val="24"/>
+          <w:szCs w:val="24"/>
+        </w:rPr>
+      </w:pPr>
+      <w:r>
+        <w:rPr>
+          <w:rFonts w:ascii="Times New Roman" w:hAnsi="Times New Roman" w:cs="Times New Roman"/>
+          <w:sz w:val="24"/>
+          <w:szCs w:val="24"/>
+        </w:rPr>
+        <w:t xml:space="preserve">The application is divided into two independently deployed components:</w:t>
+      </w:r>
+    </w:p>
+    <w:p>
+      <w:pPr>
+        <w:rPr>
+          <w:rFonts w:ascii="Times New Roman" w:hAnsi="Times New Roman" w:cs="Times New Roman"/>
+          <w:sz w:val="24"/>
+          <w:szCs w:val="24"/>
+        </w:rPr>
+      </w:pPr>
+      <w:r>
+        <w:rPr>
+          <w:b/>
+          <w:rFonts w:ascii="Times New Roman" w:hAnsi="Times New Roman" w:cs="Times New Roman"/>
+          <w:sz w:val="24"/>
+          <w:szCs w:val="24"/>
+        </w:rPr>
+        <w:t xml:space="preserve">Backend (Railway): </w:t>
+      </w:r>
+      <w:r>
+        <w:rPr>
+          <w:rFonts w:ascii="Times New Roman" w:hAnsi="Times New Roman" w:cs="Times New Roman"/>
+          <w:sz w:val="24"/>
+          <w:szCs w:val="24"/>
+        </w:rPr>
+        <w:t xml:space="preserve">The Django REST API is containerised using Docker and deployed on Railway. Railway was selected for its native Dockerfile support, automatic HTTPS provisioning, and zero-configuration PostgreSQL-compatible database add-ons. The backend handles all OCR processing (Gemini via OpenRouter and Calamari engines), file validation, and contact message storage. Environment variables including SECRET_KEY, CORS_ALLOWED_ORIGINS, CSRF_TRUSTED_ORIGINS, and OPENROUTER_API_KEY are managed through Railway’s environment variable dashboard. The service is accessible at: https://independent-insight-production-443f.up.railway.app</w:t>
+      </w:r>
+    </w:p>
+    <w:p>
+      <w:pPr>
+        <w:rPr>
+          <w:rFonts w:ascii="Times New Roman" w:hAnsi="Times New Roman" w:cs="Times New Roman"/>
+          <w:sz w:val="24"/>
+          <w:szCs w:val="24"/>
+        </w:rPr>
+      </w:pPr>
+      <w:r>
+        <w:rPr>
+          <w:b/>
+          <w:rFonts w:ascii="Times New Roman" w:hAnsi="Times New Roman" w:cs="Times New Roman"/>
+          <w:sz w:val="24"/>
+          <w:szCs w:val="24"/>
+        </w:rPr>
+        <w:t xml:space="preserve">Frontend (Netlify): </w:t>
+      </w:r>
+      <w:r>
+        <w:rPr>
+          <w:rFonts w:ascii="Times New Roman" w:hAnsi="Times New Roman" w:cs="Times New Roman"/>
+          <w:sz w:val="24"/>
+          <w:szCs w:val="24"/>
+        </w:rPr>
+        <w:t xml:space="preserve">The React + TypeScript + Vite frontend is deployed on Netlify via continuous deployment from the GitHub repository. Netlify was chosen for its seamless GitHub integration, instant global CDN distribution, and automatic preview deployments. The VITE_API_BASE_URL environment variable is configured in Netlify’s dashboard to point to the Railway backend URL. A _redirects file (/* /index.html 200) is included in the public directory to ensure correct SPA routing behaviour. The frontend is accessible at: https://text-recognition-of-capstone.netlify.app</w:t>
+      </w:r>
+    </w:p>
+    <w:p>
+      <w:pPr>
+        <w:pStyle w:val="Heading2"/>
+      </w:pPr>
+      <w:r>
+        <w:t>Key Configuration Changes for Deployment</w:t>
+      </w:r>
+    </w:p>
+    <w:p>
+      <w:pPr>
+        <w:rPr>
+          <w:rFonts w:ascii="Times New Roman" w:hAnsi="Times New Roman" w:cs="Times New Roman"/>
+          <w:sz w:val="24"/>
+          <w:szCs w:val="24"/>
+        </w:rPr>
+      </w:pPr>
+      <w:r>
+        <w:rPr>
+          <w:rFonts w:ascii="Times New Roman" w:hAnsi="Times New Roman" w:cs="Times New Roman"/>
+          <w:sz w:val="24"/>
+          <w:szCs w:val="24"/>
+        </w:rPr>
+        <w:t xml:space="preserve">The following modifications were made to the codebase to support cloud deployment:</w:t>
+      </w:r>
+    </w:p>
+    <w:p>
+      <w:pPr>
+        <w:rPr>
+          <w:rFonts w:ascii="Times New Roman" w:hAnsi="Times New Roman" w:cs="Times New Roman"/>
+          <w:sz w:val="24"/>
+          <w:szCs w:val="24"/>
+        </w:rPr>
+      </w:pPr>
+      <w:r>
+        <w:rPr>
+          <w:b/>
+          <w:rFonts w:ascii="Times New Roman" w:hAnsi="Times New Roman" w:cs="Times New Roman"/>
+          <w:sz w:val="24"/>
+          <w:szCs w:val="24"/>
+        </w:rPr>
+        <w:t xml:space="preserve">Production WSGI Server: </w:t>
+      </w:r>
+      <w:r>
+        <w:rPr>
+          <w:rFonts w:ascii="Times New Roman" w:hAnsi="Times New Roman" w:cs="Times New Roman"/>
+          <w:sz w:val="24"/>
+          <w:szCs w:val="24"/>
+        </w:rPr>
+        <w:t xml:space="preserve">Gunicorn (gunicorn==21.2.0) was added as the production WSGI server, replacing Django’s built-in development server. The server is configured with a single worker process and a 120-second timeout to accommodate OCR processing time within Railway’s 1 GB memory constraint.</w:t>
+      </w:r>
+    </w:p>
+    <w:p>
+      <w:pPr>
+        <w:rPr>
+          <w:rFonts w:ascii="Times New Roman" w:hAnsi="Times New Roman" w:cs="Times New Roman"/>
+          <w:sz w:val="24"/>
+          <w:szCs w:val="24"/>
+        </w:rPr>
+      </w:pPr>
+      <w:r>
+        <w:rPr>
+          <w:b/>
+          <w:rFonts w:ascii="Times New Roman" w:hAnsi="Times New Roman" w:cs="Times New Roman"/>
+          <w:sz w:val="24"/>
+          <w:szCs w:val="24"/>
+        </w:rPr>
+        <w:t xml:space="preserve">Static File Serving: </w:t>
+      </w:r>
+      <w:r>
+        <w:rPr>
+          <w:rFonts w:ascii="Times New Roman" w:hAnsi="Times New Roman" w:cs="Times New Roman"/>
+          <w:sz w:val="24"/>
+          <w:szCs w:val="24"/>
+        </w:rPr>
+        <w:t xml:space="preserve">WhiteNoise (whitenoise==6.7.0) was integrated into the Django middleware stack to serve static files directly from the application container, eliminating the need for a separate file server such as Nginx.</w:t>
+      </w:r>
+    </w:p>
+    <w:p>
+      <w:pPr>
+        <w:rPr>
+          <w:rFonts w:ascii="Times New Roman" w:hAnsi="Times New Roman" w:cs="Times New Roman"/>
+          <w:sz w:val="24"/>
+          <w:szCs w:val="24"/>
+        </w:rPr>
+      </w:pPr>
+      <w:r>
+        <w:rPr>
+          <w:b/>
+          <w:rFonts w:ascii="Times New Roman" w:hAnsi="Times New Roman" w:cs="Times New Roman"/>
+          <w:sz w:val="24"/>
+          <w:szCs w:val="24"/>
+        </w:rPr>
+        <w:t xml:space="preserve">CORS and CSRF Configuration: </w:t>
+      </w:r>
+      <w:r>
+        <w:rPr>
+          <w:rFonts w:ascii="Times New Roman" w:hAnsi="Times New Roman" w:cs="Times New Roman"/>
+          <w:sz w:val="24"/>
+          <w:szCs w:val="24"/>
+        </w:rPr>
+        <w:t xml:space="preserve">Django’s CORS_ALLOWED_ORIGINS and CSRF_TRUSTED_ORIGINS settings are now dynamically populated from environment variables, enabling secure cross-origin requests between the Netlify frontend and the Railway backend.</w:t>
+      </w:r>
+    </w:p>
+    <w:p>
+      <w:pPr>
+        <w:rPr>
+          <w:rFonts w:ascii="Times New Roman" w:hAnsi="Times New Roman" w:cs="Times New Roman"/>
+          <w:sz w:val="24"/>
+          <w:szCs w:val="24"/>
+        </w:rPr>
+      </w:pPr>
+      <w:r>
+        <w:rPr>
+          <w:b/>
+          <w:rFonts w:ascii="Times New Roman" w:hAnsi="Times New Roman" w:cs="Times New Roman"/>
+          <w:sz w:val="24"/>
+          <w:szCs w:val="24"/>
+        </w:rPr>
+        <w:t xml:space="preserve">Lazy Model Loading: </w:t>
+      </w:r>
+      <w:r>
+        <w:rPr>
+          <w:rFonts w:ascii="Times New Roman" w:hAnsi="Times New Roman" w:cs="Times New Roman"/>
+          <w:sz w:val="24"/>
+          <w:szCs w:val="24"/>
+        </w:rPr>
+        <w:t xml:space="preserve">The CalamariOCRService import was moved from module-level to inside the request handler so that TensorFlow and the Calamari neural network models are only loaded on demand. This change prevents an out-of-memory (OOM) crash at startup caused by TensorFlow allocating approximately 1 GB of RAM before any request is served.</w:t>
+      </w:r>
+    </w:p>
+    <w:p>
+      <w:pPr>
+        <w:pStyle w:val="Heading1"/>
+      </w:pPr>
+      <w:r>
+        <w:t>7. Important Notice: Memory Limitations for Large Batch Recognition</w:t>
+      </w:r>
+    </w:p>
+    <w:p>
+      <w:pPr>
+        <w:rPr>
+          <w:rFonts w:ascii="Times New Roman" w:hAnsi="Times New Roman" w:cs="Times New Roman"/>
+          <w:sz w:val="24"/>
+          <w:szCs w:val="24"/>
+        </w:rPr>
+      </w:pPr>
+      <w:r>
+        <w:rPr>
+          <w:rFonts w:ascii="Times New Roman" w:hAnsi="Times New Roman" w:cs="Times New Roman"/>
+          <w:sz w:val="24"/>
+          <w:szCs w:val="24"/>
+        </w:rPr>
+        <w:t xml:space="preserve">The cloud-hosted version of Deciffer runs on a server with approximately 1 GB of available RAM. While this is sufficient for typical single-image or small-batch recognition tasks using the Gemini engine, it imposes strict constraints on workloads that load large machine learning models into memory.</w:t>
+      </w:r>
+    </w:p>
+    <w:p>
+      <w:pPr>
+        <w:pStyle w:val="Heading2"/>
+      </w:pPr>
+      <w:r>
+        <w:t>When to Use Local Docker Deployment Instead</w:t>
+      </w:r>
+    </w:p>
+    <w:p>
+      <w:pPr>
+        <w:rPr>
+          <w:rFonts w:ascii="Times New Roman" w:hAnsi="Times New Roman" w:cs="Times New Roman"/>
+          <w:sz w:val="24"/>
+          <w:szCs w:val="24"/>
+        </w:rPr>
+      </w:pPr>
+      <w:r>
+        <w:rPr>
+          <w:rFonts w:ascii="Times New Roman" w:hAnsi="Times New Roman" w:cs="Times New Roman"/>
+          <w:sz w:val="24"/>
+          <w:szCs w:val="24"/>
+        </w:rPr>
+        <w:t xml:space="preserve">Users are strongly advised to use the local Docker deployment for the following scenarios:</w:t>
+      </w:r>
+    </w:p>
+    <w:p>
+      <w:pPr>
+        <w:rPr>
+          <w:rFonts w:ascii="Times New Roman" w:hAnsi="Times New Roman" w:cs="Times New Roman"/>
+          <w:sz w:val="24"/>
+          <w:szCs w:val="24"/>
+        </w:rPr>
+      </w:pPr>
+      <w:r>
+        <w:rPr>
+          <w:b/>
+          <w:rFonts w:ascii="Times New Roman" w:hAnsi="Times New Roman" w:cs="Times New Roman"/>
+          <w:sz w:val="24"/>
+          <w:szCs w:val="24"/>
+        </w:rPr>
+        <w:t xml:space="preserve">Large batch image recognition: </w:t>
+      </w:r>
+      <w:r>
+        <w:rPr>
+          <w:rFonts w:ascii="Times New Roman" w:hAnsi="Times New Roman" w:cs="Times New Roman"/>
+          <w:sz w:val="24"/>
+          <w:szCs w:val="24"/>
+        </w:rPr>
+        <w:t xml:space="preserve">Uploading many images simultaneously (typically more than 5 to 10 high-resolution images) may exhaust server memory and result in the request being terminated with an out-of-memory error.</w:t>
+      </w:r>
+    </w:p>
+    <w:p>
+      <w:pPr>
+        <w:rPr>
+          <w:rFonts w:ascii="Times New Roman" w:hAnsi="Times New Roman" w:cs="Times New Roman"/>
+          <w:sz w:val="24"/>
+          <w:szCs w:val="24"/>
+        </w:rPr>
+      </w:pPr>
+      <w:r>
+        <w:rPr>
+          <w:b/>
+          <w:rFonts w:ascii="Times New Roman" w:hAnsi="Times New Roman" w:cs="Times New Roman"/>
+          <w:sz w:val="24"/>
+          <w:szCs w:val="24"/>
+        </w:rPr>
+        <w:t xml:space="preserve">Calamari OCR engine: </w:t>
+      </w:r>
+      <w:r>
+        <w:rPr>
+          <w:rFonts w:ascii="Times New Roman" w:hAnsi="Times New Roman" w:cs="Times New Roman"/>
+          <w:sz w:val="24"/>
+          <w:szCs w:val="24"/>
+        </w:rPr>
+        <w:t xml:space="preserve">The Calamari engine loads TensorFlow and pre-trained neural network models into memory on first use. This can consume nearly all available RAM on the cloud server. Repeated Calamari requests or concurrent usage will likely trigger an OOM crash and force a container restart. For any serious Calamari-based recognition workload, local deployment is required.</w:t>
+      </w:r>
+    </w:p>
+    <w:p>
+      <w:pPr>
+        <w:rPr>
+          <w:rFonts w:ascii="Times New Roman" w:hAnsi="Times New Roman" w:cs="Times New Roman"/>
+          <w:sz w:val="24"/>
+          <w:szCs w:val="24"/>
+        </w:rPr>
+      </w:pPr>
+      <w:r>
+        <w:rPr>
+          <w:b/>
+          <w:rFonts w:ascii="Times New Roman" w:hAnsi="Times New Roman" w:cs="Times New Roman"/>
+          <w:sz w:val="24"/>
+          <w:szCs w:val="24"/>
+        </w:rPr>
+        <w:t xml:space="preserve">ZIP archive batch jobs: </w:t>
+      </w:r>
+      <w:r>
+        <w:rPr>
+          <w:rFonts w:ascii="Times New Roman" w:hAnsi="Times New Roman" w:cs="Times New Roman"/>
+          <w:sz w:val="24"/>
+          <w:szCs w:val="24"/>
+        </w:rPr>
+        <w:t xml:space="preserve">Uploading a ZIP archive containing a large number of images extracts all files into memory concurrently via a thread pool. On a constrained cloud server this can rapidly exhaust available RAM.</w:t>
+      </w:r>
+    </w:p>
+    <w:p>
+      <w:pPr>
+        <w:pStyle w:val="Heading2"/>
+      </w:pPr>
+      <w:r>
+        <w:t>How to Run Locally with Docker</w:t>
+      </w:r>
+    </w:p>
+    <w:p>
+      <w:pPr>
+        <w:rPr>
+          <w:rFonts w:ascii="Times New Roman" w:hAnsi="Times New Roman" w:cs="Times New Roman"/>
+          <w:sz w:val="24"/>
+          <w:szCs w:val="24"/>
+        </w:rPr>
+      </w:pPr>
+      <w:r>
+        <w:rPr>
+          <w:rFonts w:ascii="Times New Roman" w:hAnsi="Times New Roman" w:cs="Times New Roman"/>
+          <w:sz w:val="24"/>
+          <w:szCs w:val="24"/>
+        </w:rPr>
+        <w:t xml:space="preserve">To run the full application stack locally without memory constraints, follow these steps:</w:t>
+      </w:r>
+    </w:p>
+    <w:p>
+      <w:pPr>
+        <w:rPr>
+          <w:rFonts w:ascii="Times New Roman" w:hAnsi="Times New Roman" w:cs="Times New Roman"/>
+          <w:sz w:val="24"/>
+          <w:szCs w:val="24"/>
+        </w:rPr>
+      </w:pPr>
+      <w:r>
+        <w:rPr>
+          <w:rFonts w:ascii="Times New Roman" w:hAnsi="Times New Roman" w:cs="Times New Roman"/>
+          <w:sz w:val="24"/>
+          <w:szCs w:val="24"/>
+        </w:rPr>
+        <w:t xml:space="preserve">1. Clone the repository and navigate to the project root directory.</w:t>
+      </w:r>
+    </w:p>
+    <w:p>
+      <w:pPr>
+        <w:rPr>
+          <w:rFonts w:ascii="Times New Roman" w:hAnsi="Times New Roman" w:cs="Times New Roman"/>
+          <w:sz w:val="24"/>
+          <w:szCs w:val="24"/>
+        </w:rPr>
+      </w:pPr>
+      <w:r>
+        <w:rPr>
+          <w:rFonts w:ascii="Times New Roman" w:hAnsi="Times New Roman" w:cs="Times New Roman"/>
+          <w:sz w:val="24"/>
+          <w:szCs w:val="24"/>
+        </w:rPr>
+        <w:t xml:space="preserve">2. Copy Backend/src/.env.example to Backend/src/.env and populate the required environment variables (SECRET_KEY, OPENROUTER_API_KEY, DATABASE_URL, etc.).</w:t>
+      </w:r>
+    </w:p>
+    <w:p>
+      <w:pPr>
+        <w:rPr>
+          <w:rFonts w:ascii="Times New Roman" w:hAnsi="Times New Roman" w:cs="Times New Roman"/>
+          <w:sz w:val="24"/>
+          <w:szCs w:val="24"/>
+        </w:rPr>
+      </w:pPr>
+      <w:r>
+        <w:rPr>
+          <w:rFonts w:ascii="Times New Roman" w:hAnsi="Times New Roman" w:cs="Times New Roman"/>
+          <w:sz w:val="24"/>
+          <w:szCs w:val="24"/>
+        </w:rPr>
+        <w:t xml:space="preserve">3. Run docker compose up --build from the project root to start both the backend API and the database. The backend will be available at http://localhost:8000.</w:t>
+      </w:r>
+    </w:p>
+    <w:p>
+      <w:pPr>
+        <w:rPr>
+          <w:rFonts w:ascii="Times New Roman" w:hAnsi="Times New Roman" w:cs="Times New Roman"/>
+          <w:sz w:val="24"/>
+          <w:szCs w:val="24"/>
+        </w:rPr>
+      </w:pPr>
+      <w:r>
+        <w:rPr>
+          <w:rFonts w:ascii="Times New Roman" w:hAnsi="Times New Roman" w:cs="Times New Roman"/>
+          <w:sz w:val="24"/>
+          <w:szCs w:val="24"/>
+        </w:rPr>
+        <w:t xml:space="preserve">4. In a separate terminal, navigate to OCR-FRONTEND, run npm install followed by npm run dev. The frontend development server will be available at http://localhost:5173.</w:t>
+      </w:r>
+    </w:p>
+    <w:p>
+      <w:pPr>
+        <w:rPr>
+          <w:rFonts w:ascii="Times New Roman" w:hAnsi="Times New Roman" w:cs="Times New Roman"/>
+          <w:sz w:val="24"/>
+          <w:szCs w:val="24"/>
+        </w:rPr>
+      </w:pPr>
+      <w:r>
+        <w:rPr>
+          <w:rFonts w:ascii="Times New Roman" w:hAnsi="Times New Roman" w:cs="Times New Roman"/>
+          <w:sz w:val="24"/>
+          <w:szCs w:val="24"/>
+        </w:rPr>
+        <w:t xml:space="preserve">Running locally removes all memory constraints and allows the Calamari engine and large batch jobs to operate without the risk of OOM termination.</w:t>
+      </w:r>
+    </w:p>
+    <w:p>
+      <w:pPr>
+        <w:pStyle w:val="Heading1"/>
         <w:rPr>
           <w:rFonts w:ascii="Times New Roman" w:hAnsi="Times New Roman" w:cs="Times New Roman"/>
         </w:rPr>
@@ -6997,7 +7466,7 @@
           <w:rFonts w:ascii="Times New Roman" w:hAnsi="Times New Roman" w:cs="Times New Roman"/>
         </w:rPr>
         <w:lastRenderedPageBreak/>
-        <w:t>6. Project Structure</w:t>
+        <w:t>8. Project Structure</w:t>
       </w:r>
       <w:bookmarkEnd w:id="49"/>
     </w:p>
@@ -7502,7 +7971,7 @@
         <w:rPr>
           <w:rFonts w:ascii="Times New Roman" w:hAnsi="Times New Roman" w:cs="Times New Roman"/>
         </w:rPr>
-        <w:t>7. Daily Startup</w:t>
+        <w:t>9. Daily Startup</w:t>
       </w:r>
       <w:bookmarkEnd w:id="50"/>
     </w:p>
@@ -7785,7 +8254,7 @@
         <w:rPr>
           <w:rFonts w:ascii="Times New Roman" w:hAnsi="Times New Roman" w:cs="Times New Roman"/>
         </w:rPr>
-        <w:t>8. Using the Application</w:t>
+        <w:t>10. Using the Application</w:t>
       </w:r>
       <w:bookmarkEnd w:id="58"/>
     </w:p>
@@ -8413,7 +8882,7 @@
         <w:rPr>
           <w:rFonts w:ascii="Times New Roman" w:hAnsi="Times New Roman" w:cs="Times New Roman"/>
         </w:rPr>
-        <w:t>9. Configuration Reference</w:t>
+        <w:t>11. Configuration Reference</w:t>
       </w:r>
       <w:bookmarkEnd w:id="70"/>
     </w:p>
@@ -9757,7 +10226,7 @@
           <w:rFonts w:ascii="Times New Roman" w:hAnsi="Times New Roman" w:cs="Times New Roman"/>
         </w:rPr>
         <w:lastRenderedPageBreak/>
-        <w:t>10. API Reference</w:t>
+        <w:t>12. API Reference</w:t>
       </w:r>
       <w:bookmarkEnd w:id="72"/>
     </w:p>
@@ -10658,7 +11127,7 @@
         <w:rPr>
           <w:rFonts w:ascii="Times New Roman" w:hAnsi="Times New Roman" w:cs="Times New Roman"/>
         </w:rPr>
-        <w:t>11. Security and Privacy Notes</w:t>
+        <w:t>13. Security and Privacy Notes</w:t>
       </w:r>
       <w:bookmarkEnd w:id="82"/>
     </w:p>
@@ -10901,7 +11370,7 @@
         <w:rPr>
           <w:rFonts w:ascii="Times New Roman" w:hAnsi="Times New Roman" w:cs="Times New Roman"/>
         </w:rPr>
-        <w:t>12. Stopping the Application</w:t>
+        <w:t>14. Stopping the Application</w:t>
       </w:r>
       <w:bookmarkEnd w:id="84"/>
     </w:p>
@@ -11087,7 +11556,7 @@
         <w:rPr>
           <w:rFonts w:ascii="Times New Roman" w:hAnsi="Times New Roman" w:cs="Times New Roman"/>
         </w:rPr>
-        <w:t>13. Troubleshooting</w:t>
+        <w:t>15. Troubleshooting</w:t>
       </w:r>
       <w:bookmarkEnd w:id="86"/>
     </w:p>
@@ -11694,7 +12163,7 @@
           <w:rFonts w:ascii="Times New Roman" w:hAnsi="Times New Roman" w:cs="Times New Roman"/>
         </w:rPr>
         <w:lastRenderedPageBreak/>
-        <w:t>14. Frequently Asked Questions</w:t>
+        <w:t>16. Frequently Asked Questions</w:t>
       </w:r>
       <w:bookmarkEnd w:id="108"/>
     </w:p>
@@ -11999,7 +12468,7 @@
         <w:rPr>
           <w:rFonts w:ascii="Times New Roman" w:hAnsi="Times New Roman" w:cs="Times New Roman"/>
         </w:rPr>
-        <w:t>15. Team and Support</w:t>
+        <w:t>17. Team and Support</w:t>
       </w:r>
       <w:bookmarkEnd w:id="110"/>
     </w:p>
@@ -12325,7 +12794,7 @@
           <w:rFonts w:ascii="Times New Roman" w:hAnsi="Times New Roman" w:cs="Times New Roman"/>
         </w:rPr>
         <w:lastRenderedPageBreak/>
-        <w:t>16. Glossary</w:t>
+        <w:t>18. Glossary</w:t>
       </w:r>
       <w:bookmarkEnd w:id="112"/>
     </w:p>
@@ -12899,475 +13368,6 @@
       </w:tr>
       <w:bookmarkEnd w:id="113"/>
     </w:tbl>
-    <w:p>
-      <w:pPr>
-        <w:pStyle w:val="Heading1"/>
-      </w:pPr>
-      <w:r>
-        <w:t>Cloud Deployment Implementation</w:t>
-      </w:r>
-    </w:p>
-    <w:p>
-      <w:pPr>
-        <w:rPr>
-          <w:rFonts w:ascii="Times New Roman" w:hAnsi="Times New Roman" w:cs="Times New Roman"/>
-          <w:sz w:val="24"/>
-          <w:szCs w:val="24"/>
-        </w:rPr>
-      </w:pPr>
-      <w:r>
-        <w:rPr>
-          <w:rFonts w:ascii="Times New Roman" w:hAnsi="Times New Roman" w:cs="Times New Roman"/>
-          <w:sz w:val="24"/>
-          <w:szCs w:val="24"/>
-        </w:rPr>
-        <w:t xml:space="preserve">The Deciffer application has been deployed using a split frontend and backend architecture across two cloud platforms: Railway for the backend API and Netlify for the React frontend.</w:t>
-      </w:r>
-    </w:p>
-    <w:p>
-      <w:pPr>
-        <w:pStyle w:val="Heading2"/>
-      </w:pPr>
-      <w:r>
-        <w:t>Deployment Architecture</w:t>
-      </w:r>
-    </w:p>
-    <w:p>
-      <w:pPr>
-        <w:rPr>
-          <w:rFonts w:ascii="Times New Roman" w:hAnsi="Times New Roman" w:cs="Times New Roman"/>
-          <w:sz w:val="24"/>
-          <w:szCs w:val="24"/>
-        </w:rPr>
-      </w:pPr>
-      <w:r>
-        <w:rPr>
-          <w:rFonts w:ascii="Times New Roman" w:hAnsi="Times New Roman" w:cs="Times New Roman"/>
-          <w:sz w:val="24"/>
-          <w:szCs w:val="24"/>
-        </w:rPr>
-        <w:t xml:space="preserve">The application is divided into two independently deployed components:</w:t>
-      </w:r>
-    </w:p>
-    <w:p>
-      <w:pPr>
-        <w:rPr>
-          <w:rFonts w:ascii="Times New Roman" w:hAnsi="Times New Roman" w:cs="Times New Roman"/>
-          <w:sz w:val="24"/>
-          <w:szCs w:val="24"/>
-        </w:rPr>
-      </w:pPr>
-      <w:r>
-        <w:rPr>
-          <w:b/>
-          <w:rFonts w:ascii="Times New Roman" w:hAnsi="Times New Roman" w:cs="Times New Roman"/>
-          <w:sz w:val="24"/>
-          <w:szCs w:val="24"/>
-        </w:rPr>
-        <w:t xml:space="preserve">Backend (Railway): </w:t>
-      </w:r>
-      <w:r>
-        <w:rPr>
-          <w:rFonts w:ascii="Times New Roman" w:hAnsi="Times New Roman" w:cs="Times New Roman"/>
-          <w:sz w:val="24"/>
-          <w:szCs w:val="24"/>
-        </w:rPr>
-        <w:t xml:space="preserve">The Django REST API is containerised using Docker and deployed on Railway. Railway was selected for its native Dockerfile support, automatic HTTPS provisioning, and zero-configuration PostgreSQL-compatible database add-ons. The backend handles all OCR processing (Gemini via OpenRouter and Calamari engines), file validation, and contact message storage. Environment variables including SECRET_KEY, CORS_ALLOWED_ORIGINS, CSRF_TRUSTED_ORIGINS, and OPENROUTER_API_KEY are managed through Railway’s environment variable dashboard. The service is accessible at: https://independent-insight-production-443f.up.railway.app</w:t>
-      </w:r>
-    </w:p>
-    <w:p>
-      <w:pPr>
-        <w:rPr>
-          <w:rFonts w:ascii="Times New Roman" w:hAnsi="Times New Roman" w:cs="Times New Roman"/>
-          <w:sz w:val="24"/>
-          <w:szCs w:val="24"/>
-        </w:rPr>
-      </w:pPr>
-      <w:r>
-        <w:rPr>
-          <w:b/>
-          <w:rFonts w:ascii="Times New Roman" w:hAnsi="Times New Roman" w:cs="Times New Roman"/>
-          <w:sz w:val="24"/>
-          <w:szCs w:val="24"/>
-        </w:rPr>
-        <w:t xml:space="preserve">Frontend (Netlify): </w:t>
-      </w:r>
-      <w:r>
-        <w:rPr>
-          <w:rFonts w:ascii="Times New Roman" w:hAnsi="Times New Roman" w:cs="Times New Roman"/>
-          <w:sz w:val="24"/>
-          <w:szCs w:val="24"/>
-        </w:rPr>
-        <w:t xml:space="preserve">The React + TypeScript + Vite frontend is deployed on Netlify via continuous deployment from the GitHub repository. Netlify was chosen for its seamless GitHub integration, instant global CDN distribution, and automatic preview deployments. The VITE_API_BASE_URL environment variable is configured in Netlify’s dashboard to point to the Railway backend URL. A _redirects file (/* /index.html 200) is included in the public directory to ensure correct SPA routing behaviour. The frontend is accessible at: https://text-recognition-of-capstone.netlify.app</w:t>
-      </w:r>
-    </w:p>
-    <w:p>
-      <w:pPr>
-        <w:pStyle w:val="Heading2"/>
-      </w:pPr>
-      <w:r>
-        <w:t>Key Configuration Changes for Deployment</w:t>
-      </w:r>
-    </w:p>
-    <w:p>
-      <w:pPr>
-        <w:rPr>
-          <w:rFonts w:ascii="Times New Roman" w:hAnsi="Times New Roman" w:cs="Times New Roman"/>
-          <w:sz w:val="24"/>
-          <w:szCs w:val="24"/>
-        </w:rPr>
-      </w:pPr>
-      <w:r>
-        <w:rPr>
-          <w:rFonts w:ascii="Times New Roman" w:hAnsi="Times New Roman" w:cs="Times New Roman"/>
-          <w:sz w:val="24"/>
-          <w:szCs w:val="24"/>
-        </w:rPr>
-        <w:t xml:space="preserve">The following modifications were made to the codebase to support cloud deployment:</w:t>
-      </w:r>
-    </w:p>
-    <w:p>
-      <w:pPr>
-        <w:rPr>
-          <w:rFonts w:ascii="Times New Roman" w:hAnsi="Times New Roman" w:cs="Times New Roman"/>
-          <w:sz w:val="24"/>
-          <w:szCs w:val="24"/>
-        </w:rPr>
-      </w:pPr>
-      <w:r>
-        <w:rPr>
-          <w:b/>
-          <w:rFonts w:ascii="Times New Roman" w:hAnsi="Times New Roman" w:cs="Times New Roman"/>
-          <w:sz w:val="24"/>
-          <w:szCs w:val="24"/>
-        </w:rPr>
-        <w:t xml:space="preserve">Production WSGI Server: </w:t>
-      </w:r>
-      <w:r>
-        <w:rPr>
-          <w:rFonts w:ascii="Times New Roman" w:hAnsi="Times New Roman" w:cs="Times New Roman"/>
-          <w:sz w:val="24"/>
-          <w:szCs w:val="24"/>
-        </w:rPr>
-        <w:t xml:space="preserve">Gunicorn (gunicorn==21.2.0) was added as the production WSGI server, replacing Django’s built-in development server. The server is configured with a single worker process and a 120-second timeout to accommodate OCR processing time within Railway’s 1 GB memory constraint.</w:t>
-      </w:r>
-    </w:p>
-    <w:p>
-      <w:pPr>
-        <w:rPr>
-          <w:rFonts w:ascii="Times New Roman" w:hAnsi="Times New Roman" w:cs="Times New Roman"/>
-          <w:sz w:val="24"/>
-          <w:szCs w:val="24"/>
-        </w:rPr>
-      </w:pPr>
-      <w:r>
-        <w:rPr>
-          <w:b/>
-          <w:rFonts w:ascii="Times New Roman" w:hAnsi="Times New Roman" w:cs="Times New Roman"/>
-          <w:sz w:val="24"/>
-          <w:szCs w:val="24"/>
-        </w:rPr>
-        <w:t xml:space="preserve">Static File Serving: </w:t>
-      </w:r>
-      <w:r>
-        <w:rPr>
-          <w:rFonts w:ascii="Times New Roman" w:hAnsi="Times New Roman" w:cs="Times New Roman"/>
-          <w:sz w:val="24"/>
-          <w:szCs w:val="24"/>
-        </w:rPr>
-        <w:t xml:space="preserve">WhiteNoise (whitenoise==6.7.0) was integrated into the Django middleware stack to serve static files directly from the application container, eliminating the need for a separate file server such as Nginx.</w:t>
-      </w:r>
-    </w:p>
-    <w:p>
-      <w:pPr>
-        <w:rPr>
-          <w:rFonts w:ascii="Times New Roman" w:hAnsi="Times New Roman" w:cs="Times New Roman"/>
-          <w:sz w:val="24"/>
-          <w:szCs w:val="24"/>
-        </w:rPr>
-      </w:pPr>
-      <w:r>
-        <w:rPr>
-          <w:b/>
-          <w:rFonts w:ascii="Times New Roman" w:hAnsi="Times New Roman" w:cs="Times New Roman"/>
-          <w:sz w:val="24"/>
-          <w:szCs w:val="24"/>
-        </w:rPr>
-        <w:t xml:space="preserve">CORS and CSRF Configuration: </w:t>
-      </w:r>
-      <w:r>
-        <w:rPr>
-          <w:rFonts w:ascii="Times New Roman" w:hAnsi="Times New Roman" w:cs="Times New Roman"/>
-          <w:sz w:val="24"/>
-          <w:szCs w:val="24"/>
-        </w:rPr>
-        <w:t xml:space="preserve">Django’s CORS_ALLOWED_ORIGINS and CSRF_TRUSTED_ORIGINS settings are now dynamically populated from environment variables, enabling secure cross-origin requests between the Netlify frontend and the Railway backend.</w:t>
-      </w:r>
-    </w:p>
-    <w:p>
-      <w:pPr>
-        <w:rPr>
-          <w:rFonts w:ascii="Times New Roman" w:hAnsi="Times New Roman" w:cs="Times New Roman"/>
-          <w:sz w:val="24"/>
-          <w:szCs w:val="24"/>
-        </w:rPr>
-      </w:pPr>
-      <w:r>
-        <w:rPr>
-          <w:b/>
-          <w:rFonts w:ascii="Times New Roman" w:hAnsi="Times New Roman" w:cs="Times New Roman"/>
-          <w:sz w:val="24"/>
-          <w:szCs w:val="24"/>
-        </w:rPr>
-        <w:t xml:space="preserve">Lazy Model Loading: </w:t>
-      </w:r>
-      <w:r>
-        <w:rPr>
-          <w:rFonts w:ascii="Times New Roman" w:hAnsi="Times New Roman" w:cs="Times New Roman"/>
-          <w:sz w:val="24"/>
-          <w:szCs w:val="24"/>
-        </w:rPr>
-        <w:t xml:space="preserve">The CalamariOCRService import was moved from module-level to inside the request handler so that TensorFlow and the Calamari neural network models are only loaded on demand. This change prevents an out-of-memory (OOM) crash at startup caused by TensorFlow allocating approximately 1 GB of RAM before any request is served.</w:t>
-      </w:r>
-    </w:p>
-    <w:p>
-      <w:pPr>
-        <w:pStyle w:val="Heading1"/>
-      </w:pPr>
-      <w:r>
-        <w:t>Important Notice: Memory Limitations for Large Batch Recognition</w:t>
-      </w:r>
-    </w:p>
-    <w:p>
-      <w:pPr>
-        <w:rPr>
-          <w:rFonts w:ascii="Times New Roman" w:hAnsi="Times New Roman" w:cs="Times New Roman"/>
-          <w:sz w:val="24"/>
-          <w:szCs w:val="24"/>
-        </w:rPr>
-      </w:pPr>
-      <w:r>
-        <w:rPr>
-          <w:rFonts w:ascii="Times New Roman" w:hAnsi="Times New Roman" w:cs="Times New Roman"/>
-          <w:sz w:val="24"/>
-          <w:szCs w:val="24"/>
-        </w:rPr>
-        <w:t xml:space="preserve">The cloud-hosted version of Deciffer runs on a server with approximately 1 GB of available RAM. While this is sufficient for typical single-image or small-batch recognition tasks using the Gemini engine, it imposes strict constraints on workloads that load large machine learning models into memory.</w:t>
-      </w:r>
-    </w:p>
-    <w:p>
-      <w:pPr>
-        <w:pStyle w:val="Heading2"/>
-      </w:pPr>
-      <w:r>
-        <w:t>When to Use Local Docker Deployment Instead</w:t>
-      </w:r>
-    </w:p>
-    <w:p>
-      <w:pPr>
-        <w:rPr>
-          <w:rFonts w:ascii="Times New Roman" w:hAnsi="Times New Roman" w:cs="Times New Roman"/>
-          <w:sz w:val="24"/>
-          <w:szCs w:val="24"/>
-        </w:rPr>
-      </w:pPr>
-      <w:r>
-        <w:rPr>
-          <w:rFonts w:ascii="Times New Roman" w:hAnsi="Times New Roman" w:cs="Times New Roman"/>
-          <w:sz w:val="24"/>
-          <w:szCs w:val="24"/>
-        </w:rPr>
-        <w:t xml:space="preserve">Users are strongly advised to use the local Docker deployment for the following scenarios:</w:t>
-      </w:r>
-    </w:p>
-    <w:p>
-      <w:pPr>
-        <w:rPr>
-          <w:rFonts w:ascii="Times New Roman" w:hAnsi="Times New Roman" w:cs="Times New Roman"/>
-          <w:sz w:val="24"/>
-          <w:szCs w:val="24"/>
-        </w:rPr>
-      </w:pPr>
-      <w:r>
-        <w:rPr>
-          <w:b/>
-          <w:rFonts w:ascii="Times New Roman" w:hAnsi="Times New Roman" w:cs="Times New Roman"/>
-          <w:sz w:val="24"/>
-          <w:szCs w:val="24"/>
-        </w:rPr>
-        <w:t xml:space="preserve">Large batch image recognition: </w:t>
-      </w:r>
-      <w:r>
-        <w:rPr>
-          <w:rFonts w:ascii="Times New Roman" w:hAnsi="Times New Roman" w:cs="Times New Roman"/>
-          <w:sz w:val="24"/>
-          <w:szCs w:val="24"/>
-        </w:rPr>
-        <w:t xml:space="preserve">Uploading many images simultaneously (typically more than 5 to 10 high-resolution images) may exhaust server memory and result in the request being terminated with an out-of-memory error.</w:t>
-      </w:r>
-    </w:p>
-    <w:p>
-      <w:pPr>
-        <w:rPr>
-          <w:rFonts w:ascii="Times New Roman" w:hAnsi="Times New Roman" w:cs="Times New Roman"/>
-          <w:sz w:val="24"/>
-          <w:szCs w:val="24"/>
-        </w:rPr>
-      </w:pPr>
-      <w:r>
-        <w:rPr>
-          <w:b/>
-          <w:rFonts w:ascii="Times New Roman" w:hAnsi="Times New Roman" w:cs="Times New Roman"/>
-          <w:sz w:val="24"/>
-          <w:szCs w:val="24"/>
-        </w:rPr>
-        <w:t xml:space="preserve">Calamari OCR engine: </w:t>
-      </w:r>
-      <w:r>
-        <w:rPr>
-          <w:rFonts w:ascii="Times New Roman" w:hAnsi="Times New Roman" w:cs="Times New Roman"/>
-          <w:sz w:val="24"/>
-          <w:szCs w:val="24"/>
-        </w:rPr>
-        <w:t xml:space="preserve">The Calamari engine loads TensorFlow and pre-trained neural network models into memory on first use. This can consume nearly all available RAM on the cloud server. Repeated Calamari requests or concurrent usage will likely trigger an OOM crash and force a container restart. For any serious Calamari-based recognition workload, local deployment is required.</w:t>
-      </w:r>
-    </w:p>
-    <w:p>
-      <w:pPr>
-        <w:rPr>
-          <w:rFonts w:ascii="Times New Roman" w:hAnsi="Times New Roman" w:cs="Times New Roman"/>
-          <w:sz w:val="24"/>
-          <w:szCs w:val="24"/>
-        </w:rPr>
-      </w:pPr>
-      <w:r>
-        <w:rPr>
-          <w:b/>
-          <w:rFonts w:ascii="Times New Roman" w:hAnsi="Times New Roman" w:cs="Times New Roman"/>
-          <w:sz w:val="24"/>
-          <w:szCs w:val="24"/>
-        </w:rPr>
-        <w:t xml:space="preserve">ZIP archive batch jobs: </w:t>
-      </w:r>
-      <w:r>
-        <w:rPr>
-          <w:rFonts w:ascii="Times New Roman" w:hAnsi="Times New Roman" w:cs="Times New Roman"/>
-          <w:sz w:val="24"/>
-          <w:szCs w:val="24"/>
-        </w:rPr>
-        <w:t xml:space="preserve">Uploading a ZIP archive containing a large number of images extracts all files into memory concurrently via a thread pool. On a constrained cloud server this can rapidly exhaust available RAM.</w:t>
-      </w:r>
-    </w:p>
-    <w:p>
-      <w:pPr>
-        <w:pStyle w:val="Heading2"/>
-      </w:pPr>
-      <w:r>
-        <w:t>How to Run Locally with Docker</w:t>
-      </w:r>
-    </w:p>
-    <w:p>
-      <w:pPr>
-        <w:rPr>
-          <w:rFonts w:ascii="Times New Roman" w:hAnsi="Times New Roman" w:cs="Times New Roman"/>
-          <w:sz w:val="24"/>
-          <w:szCs w:val="24"/>
-        </w:rPr>
-      </w:pPr>
-      <w:r>
-        <w:rPr>
-          <w:rFonts w:ascii="Times New Roman" w:hAnsi="Times New Roman" w:cs="Times New Roman"/>
-          <w:sz w:val="24"/>
-          <w:szCs w:val="24"/>
-        </w:rPr>
-        <w:t xml:space="preserve">To run the full application stack locally without memory constraints, follow these steps:</w:t>
-      </w:r>
-    </w:p>
-    <w:p>
-      <w:pPr>
-        <w:rPr>
-          <w:rFonts w:ascii="Times New Roman" w:hAnsi="Times New Roman" w:cs="Times New Roman"/>
-          <w:sz w:val="24"/>
-          <w:szCs w:val="24"/>
-        </w:rPr>
-      </w:pPr>
-      <w:r>
-        <w:rPr>
-          <w:rFonts w:ascii="Times New Roman" w:hAnsi="Times New Roman" w:cs="Times New Roman"/>
-          <w:sz w:val="24"/>
-          <w:szCs w:val="24"/>
-        </w:rPr>
-        <w:t xml:space="preserve">1. Clone the repository and navigate to the project root directory.</w:t>
-      </w:r>
-    </w:p>
-    <w:p>
-      <w:pPr>
-        <w:rPr>
-          <w:rFonts w:ascii="Times New Roman" w:hAnsi="Times New Roman" w:cs="Times New Roman"/>
-          <w:sz w:val="24"/>
-          <w:szCs w:val="24"/>
-        </w:rPr>
-      </w:pPr>
-      <w:r>
-        <w:rPr>
-          <w:rFonts w:ascii="Times New Roman" w:hAnsi="Times New Roman" w:cs="Times New Roman"/>
-          <w:sz w:val="24"/>
-          <w:szCs w:val="24"/>
-        </w:rPr>
-        <w:t xml:space="preserve">2. Copy Backend/src/.env.example to Backend/src/.env and populate the required environment variables (SECRET_KEY, OPENROUTER_API_KEY, DATABASE_URL, etc.).</w:t>
-      </w:r>
-    </w:p>
-    <w:p>
-      <w:pPr>
-        <w:rPr>
-          <w:rFonts w:ascii="Times New Roman" w:hAnsi="Times New Roman" w:cs="Times New Roman"/>
-          <w:sz w:val="24"/>
-          <w:szCs w:val="24"/>
-        </w:rPr>
-      </w:pPr>
-      <w:r>
-        <w:rPr>
-          <w:rFonts w:ascii="Times New Roman" w:hAnsi="Times New Roman" w:cs="Times New Roman"/>
-          <w:sz w:val="24"/>
-          <w:szCs w:val="24"/>
-        </w:rPr>
-        <w:t xml:space="preserve">3. Run docker compose up --build from the project root to start both the backend API and the database. The backend will be available at http://localhost:8000.</w:t>
-      </w:r>
-    </w:p>
-    <w:p>
-      <w:pPr>
-        <w:rPr>
-          <w:rFonts w:ascii="Times New Roman" w:hAnsi="Times New Roman" w:cs="Times New Roman"/>
-          <w:sz w:val="24"/>
-          <w:szCs w:val="24"/>
-        </w:rPr>
-      </w:pPr>
-      <w:r>
-        <w:rPr>
-          <w:rFonts w:ascii="Times New Roman" w:hAnsi="Times New Roman" w:cs="Times New Roman"/>
-          <w:sz w:val="24"/>
-          <w:szCs w:val="24"/>
-        </w:rPr>
-        <w:t xml:space="preserve">4. In a separate terminal, navigate to OCR-FRONTEND, run npm install followed by npm run dev. The frontend development server will be available at http://localhost:5173.</w:t>
-      </w:r>
-    </w:p>
-    <w:p>
-      <w:pPr>
-        <w:rPr>
-          <w:rFonts w:ascii="Times New Roman" w:hAnsi="Times New Roman" w:cs="Times New Roman"/>
-          <w:sz w:val="24"/>
-          <w:szCs w:val="24"/>
-        </w:rPr>
-      </w:pPr>
-      <w:r>
-        <w:rPr>
-          <w:rFonts w:ascii="Times New Roman" w:hAnsi="Times New Roman" w:cs="Times New Roman"/>
-          <w:sz w:val="24"/>
-          <w:szCs w:val="24"/>
-        </w:rPr>
-        <w:t xml:space="preserve">Running locally removes all memory constraints and allows the Calamari engine and large batch jobs to operate without the risk of OOM termination.</w:t>
-      </w:r>
-    </w:p>
     <w:p>
       <w:pPr>
         <w:rPr>

</xml_diff>